<commit_message>
Disclose tawk.to live chat in the privacy policy
Adds a Live chat section between Analytics and Cookies naming Tawk.to
Inc. as a processor: that the widget loads on every page whether or not
a conversation is opened, what it processes (typed content, name, email,
IP, approximate location, browser and OS, pages viewed), transcript
retention, the shop attributes the app passes for signed-in merchants,
and tawk's own cookies, with a link to their policy.

The widget shipped in ce65634 without this disclosure, and the policy
named only Google Analytics as a third party.

Regenerates the downloadable DOCX and CSV, which pandoc builds from this
markdown and which would otherwise contradict the page. The security
policy and DPA are left alone; pandoc and Chrome rewrite them with new
embedded timestamps even when their source has not changed.

Co-Authored-By: Claude Opus 5 (1M context) <noreply@anthropic.com>
Claude-Session: https://claude.ai/code/session_01JHpfN9ih9ZfXtsqkgGd9gW
</commit_message>
<xml_diff>
--- a/public/legal/RevenueHunt-Privacy-Policy.docx
+++ b/public/legal/RevenueHunt-Privacy-Policy.docx
@@ -2,7 +2,7 @@
 <file path=word/document.xml><?xml version="1.0" encoding="utf-8"?>
 <w:document xmlns:w="http://schemas.openxmlformats.org/wordprocessingml/2006/main" xmlns:m="http://schemas.openxmlformats.org/officeDocument/2006/math" xmlns:r="http://schemas.openxmlformats.org/officeDocument/2006/relationships" xmlns:o="urn:schemas-microsoft-com:office:office" xmlns:v="urn:schemas-microsoft-com:vml" xmlns:w10="urn:schemas-microsoft-com:office:word" xmlns:a="http://schemas.openxmlformats.org/drawingml/2006/main" xmlns:pic="http://schemas.openxmlformats.org/drawingml/2006/picture" xmlns:wp="http://schemas.openxmlformats.org/drawingml/2006/wordprocessingDrawing">
   <w:body>
-    <w:bookmarkStart w:id="30" w:name="revenuehunt-privacy-policy"/>
+    <w:bookmarkStart w:id="33" w:name="revenuehunt-privacy-policy"/>
     <w:p>
       <w:pPr>
         <w:pStyle w:val="Heading1"/>
@@ -16,7 +16,7 @@
         <w:pStyle w:val="FirstParagraph"/>
       </w:pPr>
       <w:r>
-        <w:t xml:space="preserve">Last updated: July 13, 2026.</w:t>
+        <w:t xml:space="preserve">Last updated: September 3, 2026.</w:t>
       </w:r>
     </w:p>
     <w:p>
@@ -885,12 +885,95 @@
       </w:r>
     </w:p>
     <w:bookmarkEnd w:id="15"/>
-    <w:bookmarkStart w:id="16" w:name="cookies"/>
+    <w:bookmarkStart w:id="18" w:name="live-chat"/>
     <w:p>
       <w:pPr>
         <w:pStyle w:val="Heading2"/>
       </w:pPr>
       <w:r>
+        <w:t xml:space="preserve">Live chat</w:t>
+      </w:r>
+    </w:p>
+    <w:p>
+      <w:pPr>
+        <w:pStyle w:val="FirstParagraph"/>
+      </w:pPr>
+      <w:r>
+        <w:rPr>
+          <w:b/>
+          <w:bCs/>
+        </w:rPr>
+        <w:t xml:space="preserve">Third-party:</w:t>
+      </w:r>
+      <w:r>
+        <w:t xml:space="preserve"> </w:t>
+      </w:r>
+      <w:r>
+        <w:t xml:space="preserve">We use</w:t>
+      </w:r>
+      <w:r>
+        <w:t xml:space="preserve"> </w:t>
+      </w:r>
+      <w:hyperlink r:id="rId16">
+        <w:r>
+          <w:rPr>
+            <w:rStyle w:val="Hyperlink"/>
+          </w:rPr>
+          <w:t xml:space="preserve">tawk.to</w:t>
+        </w:r>
+      </w:hyperlink>
+      <w:r>
+        <w:t xml:space="preserve"> </w:t>
+      </w:r>
+      <w:r>
+        <w:t xml:space="preserve">(Tawk.to Inc.) to provide the chat widget on this website, on our documentation site, and inside the app. The widget loads on every page, whether or not you open a conversation.</w:t>
+      </w:r>
+    </w:p>
+    <w:p>
+      <w:pPr>
+        <w:pStyle w:val="BodyText"/>
+      </w:pPr>
+      <w:r>
+        <w:t xml:space="preserve">When you start a conversation, tawk.to processes what you type, including any name, email address or message content you choose to share, so that we can reply to you. It also receives technical information that your browser sends automatically, such as your IP address, approximate location, browser and operating system, and the pages you view on our site. We retain chat transcripts so that we can follow up on your request and answer you consistently if you contact us again.</w:t>
+      </w:r>
+    </w:p>
+    <w:p>
+      <w:pPr>
+        <w:pStyle w:val="BodyText"/>
+      </w:pPr>
+      <w:r>
+        <w:t xml:space="preserve">If you are signed in to the app, we also pass your shop name, shop domain, plan and account email to tawk.to, so that our support team can see who they are speaking with without asking you to repeat it.</w:t>
+      </w:r>
+    </w:p>
+    <w:p>
+      <w:pPr>
+        <w:pStyle w:val="BodyText"/>
+      </w:pPr>
+      <w:r>
+        <w:t xml:space="preserve">tawk.to sets its own cookies and browser storage to keep your conversation open as you move between pages. For details on how tawk.to handles this data, see their</w:t>
+      </w:r>
+      <w:r>
+        <w:t xml:space="preserve"> </w:t>
+      </w:r>
+      <w:hyperlink r:id="rId17">
+        <w:r>
+          <w:rPr>
+            <w:rStyle w:val="Hyperlink"/>
+          </w:rPr>
+          <w:t xml:space="preserve">privacy policy</w:t>
+        </w:r>
+      </w:hyperlink>
+      <w:r>
+        <w:t xml:space="preserve">.</w:t>
+      </w:r>
+    </w:p>
+    <w:bookmarkEnd w:id="18"/>
+    <w:bookmarkStart w:id="19" w:name="cookies"/>
+    <w:p>
+      <w:pPr>
+        <w:pStyle w:val="Heading2"/>
+      </w:pPr>
+      <w:r>
         <w:t xml:space="preserve">Cookies</w:t>
       </w:r>
     </w:p>
@@ -935,8 +1018,8 @@
         <w:t xml:space="preserve">If you edit or publish an article, an additional cookie will be saved in your browser. This cookie includes no personal data and simply indicates the post ID of the article you just edited. It expires after 1 day.</w:t>
       </w:r>
     </w:p>
-    <w:bookmarkEnd w:id="16"/>
-    <w:bookmarkStart w:id="17" w:name="X609423a5ae7eae75b97576777aa54a78083817f"/>
+    <w:bookmarkEnd w:id="19"/>
+    <w:bookmarkStart w:id="20" w:name="X609423a5ae7eae75b97576777aa54a78083817f"/>
     <w:p>
       <w:pPr>
         <w:pStyle w:val="Heading2"/>
@@ -1073,8 +1156,8 @@
         <w:t xml:space="preserve">requests.</w:t>
       </w:r>
     </w:p>
-    <w:bookmarkEnd w:id="17"/>
-    <w:bookmarkStart w:id="18" w:name="what-rights-you-have-over-your-data"/>
+    <w:bookmarkEnd w:id="20"/>
+    <w:bookmarkStart w:id="21" w:name="what-rights-you-have-over-your-data"/>
     <w:p>
       <w:pPr>
         <w:pStyle w:val="Heading2"/>
@@ -1091,8 +1174,8 @@
         <w:t xml:space="preserve">If you have an account on this site, or have left comments, you can request to receive an exported file of the personal data we hold about you, including any data you have provided to us. You can also request that we erase any personal data we hold about you. This does not include any data we are obliged to keep for administrative, legal, or security purposes.</w:t>
       </w:r>
     </w:p>
-    <w:bookmarkEnd w:id="18"/>
-    <w:bookmarkStart w:id="19" w:name="for-our-european-visitors-gdpr"/>
+    <w:bookmarkEnd w:id="21"/>
+    <w:bookmarkStart w:id="22" w:name="for-our-european-visitors-gdpr"/>
     <w:p>
       <w:pPr>
         <w:pStyle w:val="Heading2"/>
@@ -1213,8 +1296,8 @@
         <w:t xml:space="preserve">Alternatively, you may lodge a complaint with your local Data Protection Authority.</w:t>
       </w:r>
     </w:p>
-    <w:bookmarkEnd w:id="19"/>
-    <w:bookmarkStart w:id="20" w:name="X0a2b1c18273e70dfef448bf3edd8818b3018d88"/>
+    <w:bookmarkEnd w:id="22"/>
+    <w:bookmarkStart w:id="23" w:name="X0a2b1c18273e70dfef448bf3edd8818b3018d88"/>
     <w:p>
       <w:pPr>
         <w:pStyle w:val="Heading2"/>
@@ -1473,8 +1556,8 @@
         <w:t xml:space="preserve">You may also designate an authorised agent to make a request on your behalf. The agent must provide written permission from you, and we may require you to verify your identity directly with us.</w:t>
       </w:r>
     </w:p>
-    <w:bookmarkEnd w:id="20"/>
-    <w:bookmarkStart w:id="21" w:name="X4e5ae17face9297b616a2f8755cf69d2200d032"/>
+    <w:bookmarkEnd w:id="23"/>
+    <w:bookmarkStart w:id="24" w:name="X4e5ae17face9297b616a2f8755cf69d2200d032"/>
     <w:p>
       <w:pPr>
         <w:pStyle w:val="Heading2"/>
@@ -1700,8 +1783,8 @@
         <w:t xml:space="preserve">and identify the state you reside in. We respond within the timeframe required by the applicable law, which is typically 45 days from a verified request.</w:t>
       </w:r>
     </w:p>
-    <w:bookmarkEnd w:id="21"/>
-    <w:bookmarkStart w:id="24" w:name="shopify-protected-customer-data"/>
+    <w:bookmarkEnd w:id="24"/>
+    <w:bookmarkStart w:id="27" w:name="shopify-protected-customer-data"/>
     <w:p>
       <w:pPr>
         <w:pStyle w:val="Heading2"/>
@@ -1736,7 +1819,7 @@
       <w:r>
         <w:t xml:space="preserve"> </w:t>
       </w:r>
-      <w:hyperlink r:id="rId22">
+      <w:hyperlink r:id="rId25">
         <w:r>
           <w:rPr>
             <w:rStyle w:val="Hyperlink"/>
@@ -1854,7 +1937,7 @@
       <w:r>
         <w:t xml:space="preserve"> </w:t>
       </w:r>
-      <w:hyperlink r:id="rId23">
+      <w:hyperlink r:id="rId26">
         <w:r>
           <w:rPr>
             <w:rStyle w:val="Hyperlink"/>
@@ -1885,8 +1968,8 @@
         <w:t xml:space="preserve">. The DPA covers our role as a processor under GDPR, our role as a service provider under CCPA/CPRA, and our role as a processor under VCDPA, CPA, CTDPA, and UCPA, including the Standard Contractual Clauses for cross-border transfers and our subprocessor list.</w:t>
       </w:r>
     </w:p>
-    <w:bookmarkEnd w:id="24"/>
-    <w:bookmarkStart w:id="25" w:name="what-information-we-collect"/>
+    <w:bookmarkEnd w:id="27"/>
+    <w:bookmarkStart w:id="28" w:name="what-information-we-collect"/>
     <w:p>
       <w:pPr>
         <w:pStyle w:val="Heading2"/>
@@ -2003,8 +2086,8 @@
         <w:t xml:space="preserve">RevenueHunt is operated by Durian Capital Inc., incorporated in the British Virgin Islands (company number 2109760). Our servers are located in the United States (Amazon AWS).</w:t>
       </w:r>
     </w:p>
-    <w:bookmarkEnd w:id="25"/>
-    <w:bookmarkStart w:id="27" w:name="information-and-data-security"/>
+    <w:bookmarkEnd w:id="28"/>
+    <w:bookmarkStart w:id="30" w:name="information-and-data-security"/>
     <w:p>
       <w:pPr>
         <w:pStyle w:val="Heading2"/>
@@ -2023,7 +2106,7 @@
       <w:r>
         <w:t xml:space="preserve"> </w:t>
       </w:r>
-      <w:hyperlink r:id="rId26">
+      <w:hyperlink r:id="rId29">
         <w:r>
           <w:rPr>
             <w:rStyle w:val="Hyperlink"/>
@@ -2045,7 +2128,7 @@
       <w:r>
         <w:t xml:space="preserve"> </w:t>
       </w:r>
-      <w:hyperlink r:id="rId22">
+      <w:hyperlink r:id="rId25">
         <w:r>
           <w:rPr>
             <w:rStyle w:val="Hyperlink"/>
@@ -2092,8 +2175,8 @@
         <w:t xml:space="preserve">If RevenueHunt handles your personal data on our own systems or servers, we implement safeguards to prevent unauthorized access or disclosures. While we strive to safeguard the privacy of your account and other personal data in our possession, regrettably, we cannot guarantee absolute security.</w:t>
       </w:r>
     </w:p>
-    <w:bookmarkEnd w:id="27"/>
-    <w:bookmarkStart w:id="29" w:name="changes-to-this-privacy-policy"/>
+    <w:bookmarkEnd w:id="30"/>
+    <w:bookmarkStart w:id="32" w:name="changes-to-this-privacy-policy"/>
     <w:p>
       <w:pPr>
         <w:pStyle w:val="Heading2"/>
@@ -2120,7 +2203,7 @@
       <w:r>
         <w:t xml:space="preserve"> </w:t>
       </w:r>
-      <w:hyperlink r:id="rId28">
+      <w:hyperlink r:id="rId31">
         <w:r>
           <w:rPr>
             <w:rStyle w:val="Hyperlink"/>
@@ -2149,8 +2232,8 @@
         <w:t xml:space="preserve">.</w:t>
       </w:r>
     </w:p>
-    <w:bookmarkEnd w:id="29"/>
-    <w:bookmarkEnd w:id="30"/>
+    <w:bookmarkEnd w:id="32"/>
+    <w:bookmarkEnd w:id="33"/>
     <w:sectPr>
       <w:footnotePr>
         <w:numRestart w:val="eachSect"/>

</xml_diff>